<commit_message>
Team is three; tunnel requests no longer count as local; teammates can blind-mark E1 with the code
</commit_message>
<xml_diff>
--- a/docs/ZenAI-Build-Plan.docx
+++ b/docs/ZenAI-Build-Plan.docx
@@ -77,7 +77,7 @@
           <w:color w:val="1C2620"/>
           <w:sz w:val="22"/>
         </w:rPr>
-        <w:t>Abraham Irabor · Fnu Soh Tah Fon · Joseph Williams · Chinonso Egeolu</w:t>
+        <w:t>Abraham Irabor · Fnu Soh Tah Fon · Chinonso Egeolu</w:t>
       </w:r>
     </w:p>
     <w:p>
@@ -407,7 +407,7 @@
           <w:color w:val="1C2620"/>
           <w:sz w:val="22"/>
         </w:rPr>
-        <w:t>Two things to fix in the room, not by email:</w:t>
+        <w:t>One thing to fix in the room, not by email:</w:t>
       </w:r>
     </w:p>
     <w:p>
@@ -430,21 +430,7 @@
           <w:color w:val="1C2620"/>
           <w:sz w:val="22"/>
         </w:rPr>
-        <w:t xml:space="preserve"> Mine isn't on it and</w:t>
-      </w:r>
-    </w:p>
-    <w:p>
-      <w:pPr>
-        <w:spacing w:after="140"/>
-      </w:pPr>
-      <w:r>
-        <w:rPr>
-          <w:rFonts w:ascii="Calibri" w:hAnsi="Calibri"/>
-          <w:b w:val="0"/>
-          <w:color w:val="1C2620"/>
-          <w:sz w:val="22"/>
-        </w:rPr>
-        <w:t>neither is Joseph's — and the rubric grades individually (*"present in team, grade</w:t>
+        <w:t xml:space="preserve"> Mine isn't on it, and the rubric grades individually (*"present in team, grade</w:t>
       </w:r>
     </w:p>
     <w:p>
@@ -486,7 +472,7 @@
           <w:color w:val="1C2620"/>
           <w:sz w:val="22"/>
         </w:rPr>
-        <w:t>contribution from me. Every future artifact carries all four names plus a one-line</w:t>
+        <w:t>contribution from me. Every future artifact carries every name plus a one-line</w:t>
       </w:r>
     </w:p>
     <w:p>
@@ -501,57 +487,6 @@
           <w:sz w:val="22"/>
         </w:rPr>
         <w:t>"who did what", and my name goes on it because of work that's actually mine.</w:t>
-      </w:r>
-    </w:p>
-    <w:p>
-      <w:pPr>
-        <w:pStyle w:val="ListNumber"/>
-      </w:pPr>
-      <w:r>
-        <w:rPr>
-          <w:rFonts w:ascii="Calibri" w:hAnsi="Calibri"/>
-          <w:b/>
-          <w:color w:val="1C2620"/>
-          <w:sz w:val="22"/>
-        </w:rPr>
-        <w:t>Joseph hasn't appeared on anything yet.</w:t>
-      </w:r>
-      <w:r>
-        <w:rPr>
-          <w:rFonts w:ascii="Calibri" w:hAnsi="Calibri"/>
-          <w:b w:val="0"/>
-          <w:color w:val="1C2620"/>
-          <w:sz w:val="22"/>
-        </w:rPr>
-        <w:t xml:space="preserve"> Not an accusation — he may have been</w:t>
-      </w:r>
-    </w:p>
-    <w:p>
-      <w:pPr>
-        <w:spacing w:after="140"/>
-      </w:pPr>
-      <w:r>
-        <w:rPr>
-          <w:rFonts w:ascii="Calibri" w:hAnsi="Calibri"/>
-          <w:b w:val="0"/>
-          <w:color w:val="1C2620"/>
-          <w:sz w:val="22"/>
-        </w:rPr>
-        <w:t>working on something that didn't make the write-up. Worth asking directly at the</w:t>
-      </w:r>
-    </w:p>
-    <w:p>
-      <w:pPr>
-        <w:spacing w:after="140"/>
-      </w:pPr>
-      <w:r>
-        <w:rPr>
-          <w:rFonts w:ascii="Calibri" w:hAnsi="Calibri"/>
-          <w:b w:val="0"/>
-          <w:color w:val="1C2620"/>
-          <w:sz w:val="22"/>
-        </w:rPr>
-        <w:t>first meeting so the work split below is real rather than aspirational.</w:t>
       </w:r>
     </w:p>
     <w:p>
@@ -2534,7 +2469,7 @@
                 <w:color w:val="1C2620"/>
                 <w:sz w:val="19"/>
               </w:rPr>
-              <w:t>Joseph</w:t>
+              <w:t>Chinonso</w:t>
             </w:r>
           </w:p>
         </w:tc>
@@ -2677,7 +2612,7 @@
                 <w:color w:val="1C2620"/>
                 <w:sz w:val="19"/>
               </w:rPr>
-              <w:t>Deck built, rehearsed with a timer, all four names on it</w:t>
+              <w:t>Deck built, rehearsed with a timer, every name on it</w:t>
             </w:r>
           </w:p>
         </w:tc>
@@ -2862,7 +2797,7 @@
           <w:color w:val="1C2620"/>
           <w:sz w:val="32"/>
         </w:rPr>
-        <w:t>Part 4 — Dividing the work among four</w:t>
+        <w:t>Part 4 — Dividing the work</w:t>
       </w:r>
     </w:p>
     <w:p>
@@ -3233,90 +3168,6 @@
                 <w:sz w:val="19"/>
               </w:rPr>
               <w:t>Crisis classifier + threshold analysis</w:t>
-            </w:r>
-          </w:p>
-        </w:tc>
-      </w:tr>
-      <w:tr>
-        <w:tc>
-          <w:tcPr>
-            <w:tcW w:type="dxa" w:w="2412"/>
-          </w:tcPr>
-          <w:p>
-            <w:r>
-              <w:rPr>
-                <w:rFonts w:ascii="Calibri" w:hAnsi="Calibri"/>
-                <w:b/>
-                <w:color w:val="1C2620"/>
-                <w:sz w:val="19"/>
-              </w:rPr>
-              <w:t>Joseph</w:t>
-            </w:r>
-          </w:p>
-        </w:tc>
-        <w:tc>
-          <w:tcPr>
-            <w:tcW w:type="dxa" w:w="2412"/>
-          </w:tcPr>
-          <w:p>
-            <w:r>
-              <w:rPr>
-                <w:rFonts w:ascii="Calibri" w:hAnsi="Calibri"/>
-                <w:b w:val="0"/>
-                <w:color w:val="1C2620"/>
-                <w:sz w:val="19"/>
-              </w:rPr>
-              <w:t xml:space="preserve">Conversation Agent · </w:t>
-            </w:r>
-            <w:r>
-              <w:rPr>
-                <w:rFonts w:ascii="Calibri" w:hAnsi="Calibri"/>
-                <w:b/>
-                <w:color w:val="1C2620"/>
-                <w:sz w:val="19"/>
-              </w:rPr>
-              <w:t>the ACT/CBT protocol and fidelity rubric</w:t>
-            </w:r>
-            <w:r>
-              <w:rPr>
-                <w:rFonts w:ascii="Calibri" w:hAnsi="Calibri"/>
-                <w:b w:val="0"/>
-                <w:color w:val="1C2620"/>
-                <w:sz w:val="19"/>
-              </w:rPr>
-              <w:t xml:space="preserve"> · Memory · Privacy</w:t>
-            </w:r>
-          </w:p>
-        </w:tc>
-        <w:tc>
-          <w:tcPr>
-            <w:tcW w:type="dxa" w:w="2412"/>
-          </w:tcPr>
-          <w:p>
-            <w:r>
-              <w:rPr>
-                <w:rFonts w:ascii="Calibri" w:hAnsi="Calibri"/>
-                <w:b w:val="0"/>
-                <w:color w:val="1C2620"/>
-                <w:sz w:val="19"/>
-              </w:rPr>
-              <w:t>Protocol + ethics</w:t>
-            </w:r>
-          </w:p>
-        </w:tc>
-        <w:tc>
-          <w:tcPr>
-            <w:tcW w:type="dxa" w:w="2412"/>
-          </w:tcPr>
-          <w:p>
-            <w:r>
-              <w:rPr>
-                <w:rFonts w:ascii="Calibri" w:hAnsi="Calibri"/>
-                <w:b w:val="0"/>
-                <w:color w:val="1C2620"/>
-                <w:sz w:val="19"/>
-              </w:rPr>
-              <w:t>The written protocol + labelled rubric set</w:t>
             </w:r>
           </w:p>
         </w:tc>

</xml_diff>